<commit_message>
chore(plan): regenerate Sprint 1 deliverables and update status
Refs: P11
</commit_message>
<xml_diff>
--- a/deliverables/S1/HK261_SPM_FP_Team6_MasterPlan_Timeline.docx
+++ b/deliverables/S1/HK261_SPM_FP_Team6_MasterPlan_Timeline.docx
@@ -286,6 +286,56 @@
           </w:p>
         </w:tc>
       </w:tr>
+      <w:tr>
+        <w:tc>
+          <w:tcPr/>
+          <w:p>
+            <w:pPr>
+              <w:pStyle w:val="Compact"/>
+              <w:jc w:val="left"/>
+            </w:pPr>
+            <w:r>
+              <w:t xml:space="preserve">1.1-draft</w:t>
+            </w:r>
+          </w:p>
+        </w:tc>
+        <w:tc>
+          <w:tcPr/>
+          <w:p>
+            <w:pPr>
+              <w:pStyle w:val="Compact"/>
+              <w:jc w:val="left"/>
+            </w:pPr>
+            <w:r>
+              <w:t xml:space="preserve">30/10/2026</w:t>
+            </w:r>
+          </w:p>
+        </w:tc>
+        <w:tc>
+          <w:tcPr/>
+          <w:p>
+            <w:pPr>
+              <w:pStyle w:val="Compact"/>
+              <w:jc w:val="left"/>
+            </w:pPr>
+            <w:r>
+              <w:t xml:space="preserve">Nguyễn Minh Chính (PO, AI-assisted)</w:t>
+            </w:r>
+          </w:p>
+        </w:tc>
+        <w:tc>
+          <w:tcPr/>
+          <w:p>
+            <w:pPr>
+              <w:pStyle w:val="Compact"/>
+              <w:jc w:val="left"/>
+            </w:pPr>
+            <w:r>
+              <w:t xml:space="preserve">Roles confirmed; capacity 20 h per member per Sprint adopted as plan value (40 h/Sprint, 120 h, BAC 24.0 M VND); CR-06 Option B recommended; Excel version added</w:t>
+            </w:r>
+          </w:p>
+        </w:tc>
+      </w:tr>
     </w:tbl>
     <w:p>
       <w:pPr>
@@ -1430,16 +1480,6 @@
             <w:r>
               <w:t xml:space="preserve">Hồ Du Tuấn Đạt</w:t>
             </w:r>
-            <w:r>
-              <w:t xml:space="preserve"> </w:t>
-            </w:r>
-            <w:r>
-              <w:rPr>
-                <w:iCs/>
-                <w:i/>
-              </w:rPr>
-              <w:t xml:space="preserve">(to confirm)</w:t>
-            </w:r>
           </w:p>
         </w:tc>
         <w:tc>
@@ -1514,16 +1554,6 @@
             <w:r>
               <w:t xml:space="preserve">Nguyễn Minh Chính (PO)</w:t>
             </w:r>
-            <w:r>
-              <w:t xml:space="preserve"> </w:t>
-            </w:r>
-            <w:r>
-              <w:rPr>
-                <w:iCs/>
-                <w:i/>
-              </w:rPr>
-              <w:t xml:space="preserve">(to confirm)</w:t>
-            </w:r>
           </w:p>
         </w:tc>
         <w:tc>
@@ -1597,16 +1627,6 @@
             </w:pPr>
             <w:r>
               <w:t xml:space="preserve">Hồ Du Tuấn Đạt</w:t>
-            </w:r>
-            <w:r>
-              <w:t xml:space="preserve"> </w:t>
-            </w:r>
-            <w:r>
-              <w:rPr>
-                <w:iCs/>
-                <w:i/>
-              </w:rPr>
-              <w:t xml:space="preserve">(to confirm)</w:t>
             </w:r>
           </w:p>
         </w:tc>
@@ -2145,31 +2165,31 @@
               <w:jc w:val="left"/>
             </w:pPr>
             <w:r>
-              <w:t xml:space="preserve">TBD</w:t>
-            </w:r>
-          </w:p>
-        </w:tc>
-        <w:tc>
-          <w:tcPr/>
-          <w:p>
-            <w:pPr>
-              <w:pStyle w:val="Compact"/>
-              <w:jc w:val="left"/>
-            </w:pPr>
-            <w:r>
-              <w:t xml:space="preserve">TBD</w:t>
-            </w:r>
-          </w:p>
-        </w:tc>
-        <w:tc>
-          <w:tcPr/>
-          <w:p>
-            <w:pPr>
-              <w:pStyle w:val="Compact"/>
-              <w:jc w:val="left"/>
-            </w:pPr>
-            <w:r>
-              <w:t xml:space="preserve">TBD</w:t>
+              <w:t xml:space="preserve">20</w:t>
+            </w:r>
+          </w:p>
+        </w:tc>
+        <w:tc>
+          <w:tcPr/>
+          <w:p>
+            <w:pPr>
+              <w:pStyle w:val="Compact"/>
+              <w:jc w:val="left"/>
+            </w:pPr>
+            <w:r>
+              <w:t xml:space="preserve">20</w:t>
+            </w:r>
+          </w:p>
+        </w:tc>
+        <w:tc>
+          <w:tcPr/>
+          <w:p>
+            <w:pPr>
+              <w:pStyle w:val="Compact"/>
+              <w:jc w:val="left"/>
+            </w:pPr>
+            <w:r>
+              <w:t xml:space="preserve">40</w:t>
             </w:r>
           </w:p>
         </w:tc>
@@ -2190,7 +2210,7 @@
               <w:t xml:space="preserve"> </w:t>
             </w:r>
             <w:r>
-              <w:t xml:space="preserve">§2</w:t>
+              <w:t xml:space="preserve">§2 (plan value, PO 30/10/2026)</w:t>
             </w:r>
           </w:p>
         </w:tc>
@@ -2216,31 +2236,31 @@
               <w:jc w:val="left"/>
             </w:pPr>
             <w:r>
-              <w:t xml:space="preserve">TBD</w:t>
-            </w:r>
-          </w:p>
-        </w:tc>
-        <w:tc>
-          <w:tcPr/>
-          <w:p>
-            <w:pPr>
-              <w:pStyle w:val="Compact"/>
-              <w:jc w:val="left"/>
-            </w:pPr>
-            <w:r>
-              <w:t xml:space="preserve">TBD</w:t>
-            </w:r>
-          </w:p>
-        </w:tc>
-        <w:tc>
-          <w:tcPr/>
-          <w:p>
-            <w:pPr>
-              <w:pStyle w:val="Compact"/>
-              <w:jc w:val="left"/>
-            </w:pPr>
-            <w:r>
-              <w:t xml:space="preserve">TBD</w:t>
+              <w:t xml:space="preserve">20</w:t>
+            </w:r>
+          </w:p>
+        </w:tc>
+        <w:tc>
+          <w:tcPr/>
+          <w:p>
+            <w:pPr>
+              <w:pStyle w:val="Compact"/>
+              <w:jc w:val="left"/>
+            </w:pPr>
+            <w:r>
+              <w:t xml:space="preserve">20</w:t>
+            </w:r>
+          </w:p>
+        </w:tc>
+        <w:tc>
+          <w:tcPr/>
+          <w:p>
+            <w:pPr>
+              <w:pStyle w:val="Compact"/>
+              <w:jc w:val="left"/>
+            </w:pPr>
+            <w:r>
+              <w:t xml:space="preserve">40</w:t>
             </w:r>
           </w:p>
         </w:tc>
@@ -2274,31 +2294,105 @@
               <w:jc w:val="left"/>
             </w:pPr>
             <w:r>
-              <w:t xml:space="preserve">TBD</w:t>
-            </w:r>
-          </w:p>
-        </w:tc>
-        <w:tc>
-          <w:tcPr/>
-          <w:p>
-            <w:pPr>
-              <w:pStyle w:val="Compact"/>
-              <w:jc w:val="left"/>
-            </w:pPr>
-            <w:r>
-              <w:t xml:space="preserve">TBD</w:t>
-            </w:r>
-          </w:p>
-        </w:tc>
-        <w:tc>
-          <w:tcPr/>
-          <w:p>
-            <w:pPr>
-              <w:pStyle w:val="Compact"/>
-              <w:jc w:val="left"/>
-            </w:pPr>
-            <w:r>
-              <w:t xml:space="preserve">TBD</w:t>
+              <w:t xml:space="preserve">20</w:t>
+            </w:r>
+          </w:p>
+        </w:tc>
+        <w:tc>
+          <w:tcPr/>
+          <w:p>
+            <w:pPr>
+              <w:pStyle w:val="Compact"/>
+              <w:jc w:val="left"/>
+            </w:pPr>
+            <w:r>
+              <w:t xml:space="preserve">20</w:t>
+            </w:r>
+          </w:p>
+        </w:tc>
+        <w:tc>
+          <w:tcPr/>
+          <w:p>
+            <w:pPr>
+              <w:pStyle w:val="Compact"/>
+              <w:jc w:val="left"/>
+            </w:pPr>
+            <w:r>
+              <w:t xml:space="preserve">40</w:t>
+            </w:r>
+          </w:p>
+        </w:tc>
+        <w:tc>
+          <w:tcPr/>
+          <w:p>
+            <w:pPr>
+              <w:pStyle w:val="Compact"/>
+            </w:pPr>
+          </w:p>
+        </w:tc>
+      </w:tr>
+      <w:tr>
+        <w:tc>
+          <w:tcPr/>
+          <w:p>
+            <w:pPr>
+              <w:pStyle w:val="Compact"/>
+              <w:jc w:val="left"/>
+            </w:pPr>
+            <w:r>
+              <w:rPr>
+                <w:bCs/>
+                <w:b/>
+              </w:rPr>
+              <w:t xml:space="preserve">Release</w:t>
+            </w:r>
+          </w:p>
+        </w:tc>
+        <w:tc>
+          <w:tcPr/>
+          <w:p>
+            <w:pPr>
+              <w:pStyle w:val="Compact"/>
+              <w:jc w:val="left"/>
+            </w:pPr>
+            <w:r>
+              <w:rPr>
+                <w:bCs/>
+                <w:b/>
+              </w:rPr>
+              <w:t xml:space="preserve">60</w:t>
+            </w:r>
+          </w:p>
+        </w:tc>
+        <w:tc>
+          <w:tcPr/>
+          <w:p>
+            <w:pPr>
+              <w:pStyle w:val="Compact"/>
+              <w:jc w:val="left"/>
+            </w:pPr>
+            <w:r>
+              <w:rPr>
+                <w:bCs/>
+                <w:b/>
+              </w:rPr>
+              <w:t xml:space="preserve">60</w:t>
+            </w:r>
+          </w:p>
+        </w:tc>
+        <w:tc>
+          <w:tcPr/>
+          <w:p>
+            <w:pPr>
+              <w:pStyle w:val="Compact"/>
+              <w:jc w:val="left"/>
+            </w:pPr>
+            <w:r>
+              <w:rPr>
+                <w:bCs/>
+                <w:b/>
+              </w:rPr>
+              <w:t xml:space="preserve">120</w:t>
             </w:r>
           </w:p>
         </w:tc>
@@ -2321,7 +2415,7 @@
           <w:bCs/>
           <w:b/>
         </w:rPr>
-        <w:t xml:space="preserve">Planning scenario (not a commitment).</w:t>
+        <w:t xml:space="preserve">Planning scenario – adopted by the PO on 30/10/2026 as the plan value (Đạt to confirm).</w:t>
       </w:r>
       <w:r>
         <w:t xml:space="preserve"> </w:t>
@@ -2408,7 +2502,7 @@
         <w:pStyle w:val="Compact"/>
       </w:pPr>
       <w:r>
-        <w:t xml:space="preserve">Scenario above: 120 h × 200,000 =</w:t>
+        <w:t xml:space="preserve">Plan: 120 h × 200,000 =</w:t>
       </w:r>
       <w:r>
         <w:t xml:space="preserve"> </w:t>
@@ -2418,10 +2512,25 @@
           <w:bCs/>
           <w:b/>
         </w:rPr>
-        <w:t xml:space="preserve">24,000,000 VND (plan, pending confirmation)</w:t>
-      </w:r>
-      <w:r>
-        <w:t xml:space="preserve">.</w:t>
+        <w:t xml:space="preserve">24,000,000 VND (plan; capacity confirmed by the PO 30/10/2026)</w:t>
+      </w:r>
+      <w:r>
+        <w:t xml:space="preserve">. The Excel version of this plan is</w:t>
+      </w:r>
+      <w:r>
+        <w:t xml:space="preserve"> </w:t>
+      </w:r>
+      <w:r>
+        <w:rPr>
+          <w:rStyle w:val="VerbatimChar"/>
+        </w:rPr>
+        <w:t xml:space="preserve">pm/plan/HK261_SPM_FP_Team6_MasterPlan.xlsx</w:t>
+      </w:r>
+      <w:r>
+        <w:t xml:space="preserve"> </w:t>
+      </w:r>
+      <w:r>
+        <w:t xml:space="preserve">(same figures).</w:t>
       </w:r>
     </w:p>
     <w:p>

</xml_diff>

<commit_message>
docs(plan): align backlog, S1 plan, BAC and CR-06 with Master Plan v0.4
Master Plan v0.4 (PO) chosen as the single source: v0 backlog IDs
restored (29 items; CR-06 = US-26/27), AC IDs remapped in test cases
and code comments, S1_Backlog = WBS 1.x (61.5 h vs 56 h capacity),
Release Plan BAC 30,500,000 VND and expected velocity 15.4 SP,
CR-06 effort +22 h. Deliverables re-exported. All figures remain
proposals pending team approval.

Refs: P02, P03, P05, P09

Co-Authored-By: Claude Opus 5.5 <noreply@anthropic.com>
Claude-Session: https://claude.ai/code/session_018dPQXAbe9nEc4NmUbYrVzF
</commit_message>
<xml_diff>
--- a/deliverables/S1/HK261_SPM_FP_Team6_MasterPlan_Timeline.docx
+++ b/deliverables/S1/HK261_SPM_FP_Team6_MasterPlan_Timeline.docx
@@ -286,6 +286,84 @@
           </w:p>
         </w:tc>
       </w:tr>
+      <w:tr>
+        <w:tc>
+          <w:tcPr/>
+          <w:p>
+            <w:pPr>
+              <w:pStyle w:val="Compact"/>
+              <w:jc w:val="left"/>
+            </w:pPr>
+            <w:r>
+              <w:t xml:space="preserve">1.0-draft2</w:t>
+            </w:r>
+          </w:p>
+        </w:tc>
+        <w:tc>
+          <w:tcPr/>
+          <w:p>
+            <w:pPr>
+              <w:pStyle w:val="Compact"/>
+              <w:jc w:val="left"/>
+            </w:pPr>
+            <w:r>
+              <w:t xml:space="preserve">30/10/2026</w:t>
+            </w:r>
+          </w:p>
+        </w:tc>
+        <w:tc>
+          <w:tcPr/>
+          <w:p>
+            <w:pPr>
+              <w:pStyle w:val="Compact"/>
+              <w:jc w:val="left"/>
+            </w:pPr>
+            <w:r>
+              <w:t xml:space="preserve">Hồ Du Tuấn Đạt (AI-assisted)</w:t>
+            </w:r>
+          </w:p>
+        </w:tc>
+        <w:tc>
+          <w:tcPr/>
+          <w:p>
+            <w:pPr>
+              <w:pStyle w:val="Compact"/>
+              <w:jc w:val="left"/>
+            </w:pPr>
+            <w:r>
+              <w:t xml:space="preserve">Aligned to Master Plan v0.4 (Chính, PO;</w:t>
+            </w:r>
+            <w:r>
+              <w:t xml:space="preserve"> </w:t>
+            </w:r>
+            <w:r>
+              <w:rPr>
+                <w:rStyle w:val="VerbatimChar"/>
+              </w:rPr>
+              <w:t xml:space="preserve">deliverables/MasterPlan/HK261_SPM_FP_Team6_MasterPlan.xlsx</w:t>
+            </w:r>
+            <w:r>
+              <w:t xml:space="preserve">) as the single source: v0 item IDs, Sprint Goals, WBS effort 152.5 h, capacity 28 h/person/Sprint, BAC 30,500,000 VND, expected velocity 15.4 SP, CR-06 +22 h. All are</w:t>
+            </w:r>
+            <w:r>
+              <w:t xml:space="preserve"> </w:t>
+            </w:r>
+            <w:r>
+              <w:rPr>
+                <w:bCs/>
+                <w:b/>
+              </w:rPr>
+              <w:t xml:space="preserve">proposals pending approval</w:t>
+            </w:r>
+            <w:r>
+              <w:t xml:space="preserve"> </w:t>
+            </w:r>
+            <w:r>
+              <w:t xml:space="preserve">(workbook decisions 0/9 approved)</w:t>
+            </w:r>
+          </w:p>
+        </w:tc>
+      </w:tr>
     </w:tbl>
     <w:p>
       <w:pPr>
@@ -1438,31 +1516,31 @@
                 <w:iCs/>
                 <w:i/>
               </w:rPr>
-              <w:t xml:space="preserve">(to confirm)</w:t>
-            </w:r>
-          </w:p>
-        </w:tc>
-        <w:tc>
-          <w:tcPr/>
-          <w:p>
-            <w:pPr>
-              <w:pStyle w:val="Compact"/>
-              <w:jc w:val="left"/>
-            </w:pPr>
-            <w:r>
-              <w:t xml:space="preserve">"Users can register, log in and log out; an administrator can create and lock accounts; non-admins are blocked from admin functions on the server."</w:t>
-            </w:r>
-          </w:p>
-        </w:tc>
-        <w:tc>
-          <w:tcPr/>
-          <w:p>
-            <w:pPr>
-              <w:pStyle w:val="Compact"/>
-              <w:jc w:val="left"/>
-            </w:pPr>
-            <w:r>
-              <w:t xml:space="preserve">F1</w:t>
+              <w:t xml:space="preserve">(proposed, Option A)</w:t>
+            </w:r>
+          </w:p>
+        </w:tc>
+        <w:tc>
+          <w:tcPr/>
+          <w:p>
+            <w:pPr>
+              <w:pStyle w:val="Compact"/>
+              <w:jc w:val="left"/>
+            </w:pPr>
+            <w:r>
+              <w:t xml:space="preserve">An Administrator can create and lock accounts and a Customer can register, log in and log out, with admin functions blocked for every other role – F1 meets all its AC on the hosted URL; PMP v1.0 baselined.</w:t>
+            </w:r>
+          </w:p>
+        </w:tc>
+        <w:tc>
+          <w:tcPr/>
+          <w:p>
+            <w:pPr>
+              <w:pStyle w:val="Compact"/>
+              <w:jc w:val="left"/>
+            </w:pPr>
+            <w:r>
+              <w:t xml:space="preserve">F1 + hosting</w:t>
             </w:r>
           </w:p>
         </w:tc>
@@ -1522,31 +1600,31 @@
                 <w:iCs/>
                 <w:i/>
               </w:rPr>
-              <w:t xml:space="preserve">(to confirm)</w:t>
-            </w:r>
-          </w:p>
-        </w:tc>
-        <w:tc>
-          <w:tcPr/>
-          <w:p>
-            <w:pPr>
-              <w:pStyle w:val="Compact"/>
-              <w:jc w:val="left"/>
-            </w:pPr>
-            <w:r>
-              <w:t xml:space="preserve">"Admins manage books, categories and authors (soft delete), and customers browse 12 books per page, newest first, on any device." (+ CR-06 if approved)</w:t>
-            </w:r>
-          </w:p>
-        </w:tc>
-        <w:tc>
-          <w:tcPr/>
-          <w:p>
-            <w:pPr>
-              <w:pStyle w:val="Compact"/>
-              <w:jc w:val="left"/>
-            </w:pPr>
-            <w:r>
-              <w:t xml:space="preserve">F2, F3 (+CR-06)</w:t>
+              <w:t xml:space="preserve">(proposed)</w:t>
+            </w:r>
+          </w:p>
+        </w:tc>
+        <w:tc>
+          <w:tcPr/>
+          <w:p>
+            <w:pPr>
+              <w:pStyle w:val="Compact"/>
+              <w:jc w:val="left"/>
+            </w:pPr>
+            <w:r>
+              <w:t xml:space="preserve">An Administrator can manage books (soft delete), categories and authors, and a Customer can browse a responsive grid of ≥ 30 books, 12 per page, newest first – F2 and F3 meet all their AC; CR-06 processed through the CCB.</w:t>
+            </w:r>
+          </w:p>
+        </w:tc>
+        <w:tc>
+          <w:tcPr/>
+          <w:p>
+            <w:pPr>
+              <w:pStyle w:val="Compact"/>
+              <w:jc w:val="left"/>
+            </w:pPr>
+            <w:r>
+              <w:t xml:space="preserve">F2, F3 (+ CR-06 if approved)</w:t>
             </w:r>
           </w:p>
         </w:tc>
@@ -1606,31 +1684,31 @@
                 <w:iCs/>
                 <w:i/>
               </w:rPr>
-              <w:t xml:space="preserve">(to confirm)</w:t>
-            </w:r>
-          </w:p>
-        </w:tc>
-        <w:tc>
-          <w:tcPr/>
-          <w:p>
-            <w:pPr>
-              <w:pStyle w:val="Compact"/>
-              <w:jc w:val="left"/>
-            </w:pPr>
-            <w:r>
-              <w:t xml:space="preserve">"Customers open book details and search/filter by title, author, category and price range together with pagination; Release v1.0 passes UAT."</w:t>
-            </w:r>
-          </w:p>
-        </w:tc>
-        <w:tc>
-          <w:tcPr/>
-          <w:p>
-            <w:pPr>
-              <w:pStyle w:val="Compact"/>
-              <w:jc w:val="left"/>
-            </w:pPr>
-            <w:r>
-              <w:t xml:space="preserve">F4, F5</w:t>
+              <w:t xml:space="preserve">(proposed)</w:t>
+            </w:r>
+          </w:p>
+        </w:tc>
+        <w:tc>
+          <w:tcPr/>
+          <w:p>
+            <w:pPr>
+              <w:pStyle w:val="Compact"/>
+              <w:jc w:val="left"/>
+            </w:pPr>
+            <w:r>
+              <w:t xml:space="preserve">A Customer can open a book's details and search/filter the catalogue together with pagination – F4 and F5 meet all their AC, F1–F3 pass regression, v1.0 is tagged and ready for UAT.</w:t>
+            </w:r>
+          </w:p>
+        </w:tc>
+        <w:tc>
+          <w:tcPr/>
+          <w:p>
+            <w:pPr>
+              <w:pStyle w:val="Compact"/>
+              <w:jc w:val="left"/>
+            </w:pPr>
+            <w:r>
+              <w:t xml:space="preserve">F4, F5 + Release v1.0</w:t>
             </w:r>
           </w:p>
         </w:tc>
@@ -1832,19 +1910,19 @@
               <w:jc w:val="left"/>
             </w:pPr>
             <w:r>
-              <w:t xml:space="preserve">S1</w:t>
-            </w:r>
-          </w:p>
-        </w:tc>
-        <w:tc>
-          <w:tcPr/>
-          <w:p>
-            <w:pPr>
-              <w:pStyle w:val="Compact"/>
-              <w:jc w:val="left"/>
-            </w:pPr>
-            <w:r>
-              <w:t xml:space="preserve">US-01 Register · US-02 Log in/out · US-03 Admin creates &amp; locks accounts · US-04 Server-side role guard · NFR-01 Password hashing &amp; validation · NFR-03 Hosting/deploy skeleton</w:t>
+              <w:t xml:space="preserve">S1 (4 items)</w:t>
+            </w:r>
+          </w:p>
+        </w:tc>
+        <w:tc>
+          <w:tcPr/>
+          <w:p>
+            <w:pPr>
+              <w:pStyle w:val="Compact"/>
+              <w:jc w:val="left"/>
+            </w:pPr>
+            <w:r>
+              <w:t xml:space="preserve">US-01 Register (hashing, validation) · US-02 Log in/out · US-03 Admin creates &amp; locks accounts, roles, server-side guard · NFR-02 Hosting</w:t>
             </w:r>
           </w:p>
         </w:tc>
@@ -1870,19 +1948,19 @@
               <w:jc w:val="left"/>
             </w:pPr>
             <w:r>
-              <w:t xml:space="preserve">S2</w:t>
-            </w:r>
-          </w:p>
-        </w:tc>
-        <w:tc>
-          <w:tcPr/>
-          <w:p>
-            <w:pPr>
-              <w:pStyle w:val="Compact"/>
-              <w:jc w:val="left"/>
-            </w:pPr>
-            <w:r>
-              <w:t xml:space="preserve">US-05 Add book · US-06 Edit book · US-07 Hide (soft delete) book · US-08 Manage categories · US-09 Manage authors · NFR-02 Seed ≥30 books · US-10 Book grid 12/page newest first · NFR-04 Responsive UI</w:t>
+              <w:t xml:space="preserve">S2 (8 items)</w:t>
+            </w:r>
+          </w:p>
+        </w:tc>
+        <w:tc>
+          <w:tcPr/>
+          <w:p>
+            <w:pPr>
+              <w:pStyle w:val="Compact"/>
+              <w:jc w:val="left"/>
+            </w:pPr>
+            <w:r>
+              <w:t xml:space="preserve">US-08 Add book · US-09 Edit book · US-10 Delete (hide) book · US-24 Manage categories · US-25 Manage authors · US-05 Book grid 12/page newest first · NFR-01 ≥ 30 books, list &lt; 2 s · US-21 Responsive</w:t>
             </w:r>
           </w:p>
         </w:tc>
@@ -1908,19 +1986,19 @@
               <w:jc w:val="left"/>
             </w:pPr>
             <w:r>
-              <w:t xml:space="preserve">S2 (if CR-06 approved, option per CCB)</w:t>
-            </w:r>
-          </w:p>
-        </w:tc>
-        <w:tc>
-          <w:tcPr/>
-          <w:p>
-            <w:pPr>
-              <w:pStyle w:val="Compact"/>
-              <w:jc w:val="left"/>
-            </w:pPr>
-            <w:r>
-              <w:t xml:space="preserve">US-24 Store Staff role &amp; permissions · US-25 "Last updated by" audit</w:t>
+              <w:t xml:space="preserve">CR-06 (if approved, option per CCB)</w:t>
+            </w:r>
+          </w:p>
+        </w:tc>
+        <w:tc>
+          <w:tcPr/>
+          <w:p>
+            <w:pPr>
+              <w:pStyle w:val="Compact"/>
+              <w:jc w:val="left"/>
+            </w:pPr>
+            <w:r>
+              <w:t xml:space="preserve">US-26 Store Staff role &amp; permissions · US-27 "Last updated by" audit</w:t>
             </w:r>
           </w:p>
         </w:tc>
@@ -1946,19 +2024,19 @@
               <w:jc w:val="left"/>
             </w:pPr>
             <w:r>
-              <w:t xml:space="preserve">S3</w:t>
-            </w:r>
-          </w:p>
-        </w:tc>
-        <w:tc>
-          <w:tcPr/>
-          <w:p>
-            <w:pPr>
-              <w:pStyle w:val="Compact"/>
-              <w:jc w:val="left"/>
-            </w:pPr>
-            <w:r>
-              <w:t xml:space="preserve">US-11 Book detail page (+friendly not-found, Back keeps page) · US-12 Search by title/author · US-13 Filter by category &amp; price range with pagination · NFR-05 List page &lt; 2 s</w:t>
+              <w:t xml:space="preserve">S3 (2 items)</w:t>
+            </w:r>
+          </w:p>
+        </w:tc>
+        <w:tc>
+          <w:tcPr/>
+          <w:p>
+            <w:pPr>
+              <w:pStyle w:val="Compact"/>
+              <w:jc w:val="left"/>
+            </w:pPr>
+            <w:r>
+              <w:t xml:space="preserve">US-07 Book detail (friendly not-found, Back keeps page) · US-06 Search, filter, pagination</w:t>
             </w:r>
           </w:p>
         </w:tc>
@@ -2145,34 +2223,172 @@
               <w:jc w:val="left"/>
             </w:pPr>
             <w:r>
-              <w:t xml:space="preserve">TBD</w:t>
-            </w:r>
-          </w:p>
-        </w:tc>
-        <w:tc>
-          <w:tcPr/>
-          <w:p>
-            <w:pPr>
-              <w:pStyle w:val="Compact"/>
-              <w:jc w:val="left"/>
-            </w:pPr>
-            <w:r>
-              <w:t xml:space="preserve">TBD</w:t>
-            </w:r>
-          </w:p>
-        </w:tc>
-        <w:tc>
-          <w:tcPr/>
-          <w:p>
-            <w:pPr>
-              <w:pStyle w:val="Compact"/>
-              <w:jc w:val="left"/>
-            </w:pPr>
-            <w:r>
-              <w:t xml:space="preserve">TBD</w:t>
-            </w:r>
-          </w:p>
-        </w:tc>
+              <w:t xml:space="preserve">28</w:t>
+            </w:r>
+          </w:p>
+        </w:tc>
+        <w:tc>
+          <w:tcPr/>
+          <w:p>
+            <w:pPr>
+              <w:pStyle w:val="Compact"/>
+              <w:jc w:val="left"/>
+            </w:pPr>
+            <w:r>
+              <w:t xml:space="preserve">28</w:t>
+            </w:r>
+          </w:p>
+        </w:tc>
+        <w:tc>
+          <w:tcPr/>
+          <w:p>
+            <w:pPr>
+              <w:pStyle w:val="Compact"/>
+              <w:jc w:val="left"/>
+            </w:pPr>
+            <w:r>
+              <w:t xml:space="preserve">56</w:t>
+            </w:r>
+          </w:p>
+        </w:tc>
+        <w:tc>
+          <w:tcPr/>
+          <w:p>
+            <w:pPr>
+              <w:pStyle w:val="Compact"/>
+              <w:jc w:val="left"/>
+            </w:pPr>
+            <w:r>
+              <w:t xml:space="preserve">Master Plan v0.4 – PO assumption (4 h × 7 days), Đạt to confirm</w:t>
+            </w:r>
+          </w:p>
+        </w:tc>
+      </w:tr>
+      <w:tr>
+        <w:tc>
+          <w:tcPr/>
+          <w:p>
+            <w:pPr>
+              <w:pStyle w:val="Compact"/>
+              <w:jc w:val="left"/>
+            </w:pPr>
+            <w:r>
+              <w:t xml:space="preserve">S2</w:t>
+            </w:r>
+          </w:p>
+        </w:tc>
+        <w:tc>
+          <w:tcPr/>
+          <w:p>
+            <w:pPr>
+              <w:pStyle w:val="Compact"/>
+              <w:jc w:val="left"/>
+            </w:pPr>
+            <w:r>
+              <w:t xml:space="preserve">28</w:t>
+            </w:r>
+          </w:p>
+        </w:tc>
+        <w:tc>
+          <w:tcPr/>
+          <w:p>
+            <w:pPr>
+              <w:pStyle w:val="Compact"/>
+              <w:jc w:val="left"/>
+            </w:pPr>
+            <w:r>
+              <w:t xml:space="preserve">28</w:t>
+            </w:r>
+          </w:p>
+        </w:tc>
+        <w:tc>
+          <w:tcPr/>
+          <w:p>
+            <w:pPr>
+              <w:pStyle w:val="Compact"/>
+              <w:jc w:val="left"/>
+            </w:pPr>
+            <w:r>
+              <w:t xml:space="preserve">56</w:t>
+            </w:r>
+          </w:p>
+        </w:tc>
+        <w:tc>
+          <w:tcPr/>
+          <w:p>
+            <w:pPr>
+              <w:pStyle w:val="Compact"/>
+              <w:jc w:val="left"/>
+            </w:pPr>
+            <w:r>
+              <w:t xml:space="preserve">idem</w:t>
+            </w:r>
+          </w:p>
+        </w:tc>
+      </w:tr>
+      <w:tr>
+        <w:tc>
+          <w:tcPr/>
+          <w:p>
+            <w:pPr>
+              <w:pStyle w:val="Compact"/>
+              <w:jc w:val="left"/>
+            </w:pPr>
+            <w:r>
+              <w:t xml:space="preserve">S3</w:t>
+            </w:r>
+          </w:p>
+        </w:tc>
+        <w:tc>
+          <w:tcPr/>
+          <w:p>
+            <w:pPr>
+              <w:pStyle w:val="Compact"/>
+              <w:jc w:val="left"/>
+            </w:pPr>
+            <w:r>
+              <w:t xml:space="preserve">28</w:t>
+            </w:r>
+          </w:p>
+        </w:tc>
+        <w:tc>
+          <w:tcPr/>
+          <w:p>
+            <w:pPr>
+              <w:pStyle w:val="Compact"/>
+              <w:jc w:val="left"/>
+            </w:pPr>
+            <w:r>
+              <w:t xml:space="preserve">28</w:t>
+            </w:r>
+          </w:p>
+        </w:tc>
+        <w:tc>
+          <w:tcPr/>
+          <w:p>
+            <w:pPr>
+              <w:pStyle w:val="Compact"/>
+              <w:jc w:val="left"/>
+            </w:pPr>
+            <w:r>
+              <w:t xml:space="preserve">56</w:t>
+            </w:r>
+          </w:p>
+        </w:tc>
+        <w:tc>
+          <w:tcPr/>
+          <w:p>
+            <w:pPr>
+              <w:pStyle w:val="Compact"/>
+              <w:jc w:val="left"/>
+            </w:pPr>
+            <w:r>
+              <w:t xml:space="preserve">idem</w:t>
+            </w:r>
+          </w:p>
+        </w:tc>
+      </w:tr>
+      <w:tr>
         <w:tc>
           <w:tcPr/>
           <w:p>
@@ -2182,15 +2398,168 @@
             </w:pPr>
             <w:r>
               <w:rPr>
-                <w:rStyle w:val="VerbatimChar"/>
+                <w:bCs/>
+                <w:b/>
               </w:rPr>
-              <w:t xml:space="preserve">plan/INPUTS.md</w:t>
-            </w:r>
-            <w:r>
-              <w:t xml:space="preserve"> </w:t>
-            </w:r>
-            <w:r>
-              <w:t xml:space="preserve">§2</w:t>
+              <w:t xml:space="preserve">Total</w:t>
+            </w:r>
+          </w:p>
+        </w:tc>
+        <w:tc>
+          <w:tcPr/>
+          <w:p>
+            <w:pPr>
+              <w:pStyle w:val="Compact"/>
+            </w:pPr>
+          </w:p>
+        </w:tc>
+        <w:tc>
+          <w:tcPr/>
+          <w:p>
+            <w:pPr>
+              <w:pStyle w:val="Compact"/>
+            </w:pPr>
+          </w:p>
+        </w:tc>
+        <w:tc>
+          <w:tcPr/>
+          <w:p>
+            <w:pPr>
+              <w:pStyle w:val="Compact"/>
+              <w:jc w:val="left"/>
+            </w:pPr>
+            <w:r>
+              <w:rPr>
+                <w:bCs/>
+                <w:b/>
+              </w:rPr>
+              <w:t xml:space="preserve">168</w:t>
+            </w:r>
+          </w:p>
+        </w:tc>
+        <w:tc>
+          <w:tcPr/>
+          <w:p>
+            <w:pPr>
+              <w:pStyle w:val="Compact"/>
+            </w:pPr>
+          </w:p>
+        </w:tc>
+      </w:tr>
+    </w:tbl>
+    <w:p/>
+    <w:tbl>
+      <w:tblPr>
+        <w:tblStyle w:val="Table"/>
+        <w:tblW w:type="auto" w:w="0"/>
+        <w:tblLook w:firstRow="1" w:lastRow="0" w:firstColumn="0" w:lastColumn="0" w:noHBand="0" w:noVBand="0" w:val="0020"/>
+        <w:jc w:val="start"/>
+      </w:tblPr>
+      <w:tblGrid>
+        <w:gridCol w:w="1980"/>
+        <w:gridCol w:w="1980"/>
+        <w:gridCol w:w="1980"/>
+        <w:gridCol w:w="1980"/>
+      </w:tblGrid>
+      <w:tr>
+        <w:trPr>
+          <w:tblHeader w:val="true"/>
+        </w:trPr>
+        <w:tc>
+          <w:tcPr/>
+          <w:p>
+            <w:pPr>
+              <w:pStyle w:val="Compact"/>
+              <w:jc w:val="left"/>
+            </w:pPr>
+            <w:r>
+              <w:t xml:space="preserve">Sprint</w:t>
+            </w:r>
+          </w:p>
+        </w:tc>
+        <w:tc>
+          <w:tcPr/>
+          <w:p>
+            <w:pPr>
+              <w:pStyle w:val="Compact"/>
+              <w:jc w:val="left"/>
+            </w:pPr>
+            <w:r>
+              <w:t xml:space="preserve">WBS planned effort (h)</w:t>
+            </w:r>
+          </w:p>
+        </w:tc>
+        <w:tc>
+          <w:tcPr/>
+          <w:p>
+            <w:pPr>
+              <w:pStyle w:val="Compact"/>
+              <w:jc w:val="left"/>
+            </w:pPr>
+            <w:r>
+              <w:t xml:space="preserve">Capacity (h)</w:t>
+            </w:r>
+          </w:p>
+        </w:tc>
+        <w:tc>
+          <w:tcPr/>
+          <w:p>
+            <w:pPr>
+              <w:pStyle w:val="Compact"/>
+              <w:jc w:val="left"/>
+            </w:pPr>
+            <w:r>
+              <w:t xml:space="preserve">Check</w:t>
+            </w:r>
+          </w:p>
+        </w:tc>
+      </w:tr>
+      <w:tr>
+        <w:tc>
+          <w:tcPr/>
+          <w:p>
+            <w:pPr>
+              <w:pStyle w:val="Compact"/>
+              <w:jc w:val="left"/>
+            </w:pPr>
+            <w:r>
+              <w:t xml:space="preserve">S1</w:t>
+            </w:r>
+          </w:p>
+        </w:tc>
+        <w:tc>
+          <w:tcPr/>
+          <w:p>
+            <w:pPr>
+              <w:pStyle w:val="Compact"/>
+              <w:jc w:val="left"/>
+            </w:pPr>
+            <w:r>
+              <w:t xml:space="preserve">61.5</w:t>
+            </w:r>
+          </w:p>
+        </w:tc>
+        <w:tc>
+          <w:tcPr/>
+          <w:p>
+            <w:pPr>
+              <w:pStyle w:val="Compact"/>
+              <w:jc w:val="left"/>
+            </w:pPr>
+            <w:r>
+              <w:t xml:space="preserve">56</w:t>
+            </w:r>
+          </w:p>
+        </w:tc>
+        <w:tc>
+          <w:tcPr/>
+          <w:p>
+            <w:pPr>
+              <w:pStyle w:val="Compact"/>
+              <w:jc w:val="left"/>
+            </w:pPr>
+            <w:r>
+              <w:t xml:space="preserve">Over capacity by 5.5 h</w:t>
             </w:r>
           </w:p>
         </w:tc>
@@ -2216,40 +2585,32 @@
               <w:jc w:val="left"/>
             </w:pPr>
             <w:r>
-              <w:t xml:space="preserve">TBD</w:t>
-            </w:r>
-          </w:p>
-        </w:tc>
-        <w:tc>
-          <w:tcPr/>
-          <w:p>
-            <w:pPr>
-              <w:pStyle w:val="Compact"/>
-              <w:jc w:val="left"/>
-            </w:pPr>
-            <w:r>
-              <w:t xml:space="preserve">TBD</w:t>
-            </w:r>
-          </w:p>
-        </w:tc>
-        <w:tc>
-          <w:tcPr/>
-          <w:p>
-            <w:pPr>
-              <w:pStyle w:val="Compact"/>
-              <w:jc w:val="left"/>
-            </w:pPr>
-            <w:r>
-              <w:t xml:space="preserve">TBD</w:t>
-            </w:r>
-          </w:p>
-        </w:tc>
-        <w:tc>
-          <w:tcPr/>
-          <w:p>
-            <w:pPr>
-              <w:pStyle w:val="Compact"/>
-            </w:pPr>
+              <w:t xml:space="preserve">53.5</w:t>
+            </w:r>
+          </w:p>
+        </w:tc>
+        <w:tc>
+          <w:tcPr/>
+          <w:p>
+            <w:pPr>
+              <w:pStyle w:val="Compact"/>
+              <w:jc w:val="left"/>
+            </w:pPr>
+            <w:r>
+              <w:t xml:space="preserve">56</w:t>
+            </w:r>
+          </w:p>
+        </w:tc>
+        <w:tc>
+          <w:tcPr/>
+          <w:p>
+            <w:pPr>
+              <w:pStyle w:val="Compact"/>
+              <w:jc w:val="left"/>
+            </w:pPr>
+            <w:r>
+              <w:t xml:space="preserve">Within</w:t>
+            </w:r>
           </w:p>
         </w:tc>
       </w:tr>
@@ -2274,31 +2635,123 @@
               <w:jc w:val="left"/>
             </w:pPr>
             <w:r>
-              <w:t xml:space="preserve">TBD</w:t>
-            </w:r>
-          </w:p>
-        </w:tc>
-        <w:tc>
-          <w:tcPr/>
-          <w:p>
-            <w:pPr>
-              <w:pStyle w:val="Compact"/>
-              <w:jc w:val="left"/>
-            </w:pPr>
-            <w:r>
-              <w:t xml:space="preserve">TBD</w:t>
-            </w:r>
-          </w:p>
-        </w:tc>
-        <w:tc>
-          <w:tcPr/>
-          <w:p>
-            <w:pPr>
-              <w:pStyle w:val="Compact"/>
-              <w:jc w:val="left"/>
-            </w:pPr>
-            <w:r>
-              <w:t xml:space="preserve">TBD</w:t>
+              <w:t xml:space="preserve">37.5</w:t>
+            </w:r>
+          </w:p>
+        </w:tc>
+        <w:tc>
+          <w:tcPr/>
+          <w:p>
+            <w:pPr>
+              <w:pStyle w:val="Compact"/>
+              <w:jc w:val="left"/>
+            </w:pPr>
+            <w:r>
+              <w:t xml:space="preserve">56</w:t>
+            </w:r>
+          </w:p>
+        </w:tc>
+        <w:tc>
+          <w:tcPr/>
+          <w:p>
+            <w:pPr>
+              <w:pStyle w:val="Compact"/>
+              <w:jc w:val="left"/>
+            </w:pPr>
+            <w:r>
+              <w:t xml:space="preserve">Within</w:t>
+            </w:r>
+          </w:p>
+        </w:tc>
+      </w:tr>
+      <w:tr>
+        <w:tc>
+          <w:tcPr/>
+          <w:p>
+            <w:pPr>
+              <w:pStyle w:val="Compact"/>
+              <w:jc w:val="left"/>
+            </w:pPr>
+            <w:r>
+              <w:rPr>
+                <w:bCs/>
+                <w:b/>
+              </w:rPr>
+              <w:t xml:space="preserve">Total S1–S3</w:t>
+            </w:r>
+          </w:p>
+        </w:tc>
+        <w:tc>
+          <w:tcPr/>
+          <w:p>
+            <w:pPr>
+              <w:pStyle w:val="Compact"/>
+              <w:jc w:val="left"/>
+            </w:pPr>
+            <w:r>
+              <w:rPr>
+                <w:bCs/>
+                <w:b/>
+              </w:rPr>
+              <w:t xml:space="preserve">152.5</w:t>
+            </w:r>
+          </w:p>
+        </w:tc>
+        <w:tc>
+          <w:tcPr/>
+          <w:p>
+            <w:pPr>
+              <w:pStyle w:val="Compact"/>
+              <w:jc w:val="left"/>
+            </w:pPr>
+            <w:r>
+              <w:t xml:space="preserve">168</w:t>
+            </w:r>
+          </w:p>
+        </w:tc>
+        <w:tc>
+          <w:tcPr/>
+          <w:p>
+            <w:pPr>
+              <w:pStyle w:val="Compact"/>
+            </w:pPr>
+          </w:p>
+        </w:tc>
+      </w:tr>
+      <w:tr>
+        <w:tc>
+          <w:tcPr/>
+          <w:p>
+            <w:pPr>
+              <w:pStyle w:val="Compact"/>
+              <w:jc w:val="left"/>
+            </w:pPr>
+            <w:r>
+              <w:t xml:space="preserve">Closure (13–17/11, outside BAC)</w:t>
+            </w:r>
+          </w:p>
+        </w:tc>
+        <w:tc>
+          <w:tcPr/>
+          <w:p>
+            <w:pPr>
+              <w:pStyle w:val="Compact"/>
+              <w:jc w:val="left"/>
+            </w:pPr>
+            <w:r>
+              <w:t xml:space="preserve">18</w:t>
+            </w:r>
+          </w:p>
+        </w:tc>
+        <w:tc>
+          <w:tcPr/>
+          <w:p>
+            <w:pPr>
+              <w:pStyle w:val="Compact"/>
+              <w:jc w:val="left"/>
+            </w:pPr>
+            <w:r>
+              <w:t xml:space="preserve">–</w:t>
             </w:r>
           </w:p>
         </w:tc>
@@ -2321,13 +2774,13 @@
           <w:bCs/>
           <w:b/>
         </w:rPr>
-        <w:t xml:space="preserve">Planning scenario (not a commitment).</w:t>
+        <w:t xml:space="preserve">Expected velocity (plan)</w:t>
       </w:r>
       <w:r>
         <w:t xml:space="preserve"> </w:t>
       </w:r>
       <w:r>
-        <w:t xml:space="preserve">The TA working agreement used 4 focus hours per member per day [TA Process §a.3]. With 5 working days per Sprint (Fri, Mon–Thu) this gives 4 × 5 × 2 =</w:t>
+        <w:t xml:space="preserve">= reference velocity × team capacity ÷ reference capacity = 22 SP × 56 h ÷ 80 h =</w:t>
       </w:r>
       <w:r>
         <w:t xml:space="preserve"> </w:t>
@@ -2337,18 +2790,13 @@
           <w:bCs/>
           <w:b/>
         </w:rPr>
-        <w:t xml:space="preserve">40 h per Sprint (plan)</w:t>
-      </w:r>
-      <w:r>
-        <w:t xml:space="preserve">, 120 h for the release. The team must confirm or replace this figure.</w:t>
-      </w:r>
-    </w:p>
-    <w:p>
-      <w:pPr>
-        <w:pStyle w:val="BodyText"/>
-      </w:pPr>
-      <w:r>
-        <w:t xml:space="preserve">Expected velocity (SP per Sprint) = PSP ÷ 3 when the planned work is spread evenly, checked against the hours that the Sprint's tasks require (Σ task estimates ≤ capacity). It is recalculated from</w:t>
+        <w:t xml:space="preserve">15.4 SP per Sprint</w:t>
+      </w:r>
+      <w:r>
+        <w:t xml:space="preserve"> </w:t>
+      </w:r>
+      <w:r>
+        <w:t xml:space="preserve">(TA Sprint 1 plan: 22 SP against 80 h [04 §5]). It is replaced by the</w:t>
       </w:r>
       <w:r>
         <w:t xml:space="preserve"> </w:t>
@@ -2408,7 +2856,7 @@
         <w:pStyle w:val="Compact"/>
       </w:pPr>
       <w:r>
-        <w:t xml:space="preserve">Scenario above: 120 h × 200,000 =</w:t>
+        <w:t xml:space="preserve">WBS effort S1–S3: 152.5 h × 200,000 =</w:t>
       </w:r>
       <w:r>
         <w:t xml:space="preserve"> </w:t>
@@ -2418,10 +2866,10 @@
           <w:bCs/>
           <w:b/>
         </w:rPr>
-        <w:t xml:space="preserve">24,000,000 VND (plan, pending confirmation)</w:t>
-      </w:r>
-      <w:r>
-        <w:t xml:space="preserve">.</w:t>
+        <w:t xml:space="preserve">30,500,000 VND (plan, pending approval)</w:t>
+      </w:r>
+      <w:r>
+        <w:t xml:space="preserve">. Closure effort (18 h) is outside BAC because PV is defined over N = 3 Sprints.</w:t>
       </w:r>
     </w:p>
     <w:p>
@@ -2449,7 +2897,7 @@
         <w:t xml:space="preserve"> </w:t>
       </w:r>
       <w:r>
-        <w:t xml:space="preserve">→ 8.0 M (S1), 16.0 M (S2), 24.0 M (S3) under the scenario.</w:t>
+        <w:t xml:space="preserve">→ 10,166,667 (S1) · 20,333,333 (S2) · 30,500,000 VND (S3).</w:t>
       </w:r>
     </w:p>
     <w:p>
@@ -5613,7 +6061,7 @@
               <w:jc w:val="left"/>
             </w:pPr>
             <w:r>
-              <w:t xml:space="preserve">TBD</w:t>
+              <w:t xml:space="preserve">30,500,000 VND (152.5 h, plan)</w:t>
             </w:r>
           </w:p>
         </w:tc>
@@ -5690,7 +6138,7 @@
               <w:jc w:val="left"/>
             </w:pPr>
             <w:r>
-              <w:t xml:space="preserve">TBD</w:t>
+              <w:t xml:space="preserve">+22 h → 34,900,000 VND if fully approved (plan)</w:t>
             </w:r>
           </w:p>
         </w:tc>

</xml_diff>

<commit_message>
docs(backlog): record PO story-point estimates, PSP 55 and expected velocity
Estimates set by the PO from AI-suggested values; no voting rounds held (planning-poker-log v1.1). Refs: P03
</commit_message>
<xml_diff>
--- a/deliverables/S1/HK261_SPM_FP_Team6_MasterPlan_Timeline.docx
+++ b/deliverables/S1/HK261_SPM_FP_Team6_MasterPlan_Timeline.docx
@@ -336,6 +336,68 @@
           </w:p>
         </w:tc>
       </w:tr>
+      <w:tr>
+        <w:tc>
+          <w:tcPr/>
+          <w:p>
+            <w:pPr>
+              <w:pStyle w:val="Compact"/>
+              <w:jc w:val="left"/>
+            </w:pPr>
+            <w:r>
+              <w:t xml:space="preserve">1.2-draft</w:t>
+            </w:r>
+          </w:p>
+        </w:tc>
+        <w:tc>
+          <w:tcPr/>
+          <w:p>
+            <w:pPr>
+              <w:pStyle w:val="Compact"/>
+              <w:jc w:val="left"/>
+            </w:pPr>
+            <w:r>
+              <w:t xml:space="preserve">30/10/2026</w:t>
+            </w:r>
+          </w:p>
+        </w:tc>
+        <w:tc>
+          <w:tcPr/>
+          <w:p>
+            <w:pPr>
+              <w:pStyle w:val="Compact"/>
+              <w:jc w:val="left"/>
+            </w:pPr>
+            <w:r>
+              <w:t xml:space="preserve">Nguyễn Minh Chính (PO, AI-assisted)</w:t>
+            </w:r>
+          </w:p>
+        </w:tc>
+        <w:tc>
+          <w:tcPr/>
+          <w:p>
+            <w:pPr>
+              <w:pStyle w:val="Compact"/>
+              <w:jc w:val="left"/>
+            </w:pPr>
+            <w:r>
+              <w:t xml:space="preserve">SP filled from the PO estimates (</w:t>
+            </w:r>
+            <w:r>
+              <w:rPr>
+                <w:rStyle w:val="VerbatimChar"/>
+              </w:rPr>
+              <w:t xml:space="preserve">planning-poker-log.md</w:t>
+            </w:r>
+            <w:r>
+              <w:t xml:space="preserve"> </w:t>
+            </w:r>
+            <w:r>
+              <w:t xml:space="preserve">v1.1, no voting rounds): PSP = 55 SP, expected velocity 18.3 SP/Sprint; baseline row v1.0 completed</w:t>
+            </w:r>
+          </w:p>
+        </w:tc>
+      </w:tr>
     </w:tbl>
     <w:p>
       <w:pPr>
@@ -1765,7 +1827,7 @@
         <w:pStyle w:val="FirstParagraph"/>
       </w:pPr>
       <w:r>
-        <w:t xml:space="preserve">SP come from the Planning Poker log (</w:t>
+        <w:t xml:space="preserve">SP come from the estimation log (</w:t>
       </w:r>
       <w:r>
         <w:rPr>
@@ -1774,20 +1836,10 @@
         <w:t xml:space="preserve">pm/backlog/planning-poker-log.md</w:t>
       </w:r>
       <w:r>
-        <w:t xml:space="preserve">). Until votes are recorded, SP are</w:t>
-      </w:r>
-      <w:r>
         <w:t xml:space="preserve"> </w:t>
       </w:r>
       <w:r>
-        <w:rPr>
-          <w:bCs/>
-          <w:b/>
-        </w:rPr>
-        <w:t xml:space="preserve">TBD</w:t>
-      </w:r>
-      <w:r>
-        <w:t xml:space="preserve">.</w:t>
+        <w:t xml:space="preserve">v1.1). On 30/10/2026 they were set by the PO from AI-suggested values, without voting rounds; a later real session replaces them.</w:t>
       </w:r>
     </w:p>
     <w:tbl>
@@ -1876,7 +1928,7 @@
               <w:jc w:val="left"/>
             </w:pPr>
             <w:r>
-              <w:t xml:space="preserve">TBD</w:t>
+              <w:t xml:space="preserve">18</w:t>
             </w:r>
           </w:p>
         </w:tc>
@@ -1914,7 +1966,7 @@
               <w:jc w:val="left"/>
             </w:pPr>
             <w:r>
-              <w:t xml:space="preserve">TBD</w:t>
+              <w:t xml:space="preserve">24</w:t>
             </w:r>
           </w:p>
         </w:tc>
@@ -1952,7 +2004,7 @@
               <w:jc w:val="left"/>
             </w:pPr>
             <w:r>
-              <w:t xml:space="preserve">TBD</w:t>
+              <w:t xml:space="preserve">7 (Option B: US-24 = 5 in S2, US-25 = 2 in S3)</w:t>
             </w:r>
           </w:p>
         </w:tc>
@@ -1990,7 +2042,7 @@
               <w:jc w:val="left"/>
             </w:pPr>
             <w:r>
-              <w:t xml:space="preserve">TBD</w:t>
+              <w:t xml:space="preserve">13</w:t>
             </w:r>
           </w:p>
         </w:tc>
@@ -2028,7 +2080,13 @@
                 <w:bCs/>
                 <w:b/>
               </w:rPr>
-              <w:t xml:space="preserve">PSP = TBD</w:t>
+              <w:t xml:space="preserve">PSP = 55</w:t>
+            </w:r>
+            <w:r>
+              <w:t xml:space="preserve"> </w:t>
+            </w:r>
+            <w:r>
+              <w:t xml:space="preserve">(62 if CR-06 is approved)</w:t>
             </w:r>
           </w:p>
         </w:tc>
@@ -2442,7 +2500,20 @@
         <w:pStyle w:val="BodyText"/>
       </w:pPr>
       <w:r>
-        <w:t xml:space="preserve">Expected velocity (SP per Sprint) = PSP ÷ 3 when the planned work is spread evenly, checked against the hours that the Sprint's tasks require (Σ task estimates ≤ capacity). It is recalculated from</w:t>
+        <w:t xml:space="preserve">Expected velocity (SP per Sprint) = PSP ÷ 3 when the planned work is spread evenly, checked against the hours that the Sprint's tasks require (Σ task estimates ≤ capacity). With PSP = 55:</w:t>
+      </w:r>
+      <w:r>
+        <w:t xml:space="preserve"> </w:t>
+      </w:r>
+      <w:r>
+        <w:rPr>
+          <w:bCs/>
+          <w:b/>
+        </w:rPr>
+        <w:t xml:space="preserve">expected velocity = 55 ÷ 3 ≈ 18.3 SP per Sprint (plan)</w:t>
+      </w:r>
+      <w:r>
+        <w:t xml:space="preserve">. The allocation by feature gives S1 18, S2 24, S3 13 SP, so S2 is above the average and S3 below it; the hours check (Σ task estimates ≤ 40 h) is the binding limit. It is recalculated from</w:t>
       </w:r>
       <w:r>
         <w:t xml:space="preserve"> </w:t>
@@ -5710,19 +5781,19 @@
               <w:jc w:val="left"/>
             </w:pPr>
             <w:r>
-              <w:t xml:space="preserve">TBD</w:t>
-            </w:r>
-          </w:p>
-        </w:tc>
-        <w:tc>
-          <w:tcPr/>
-          <w:p>
-            <w:pPr>
-              <w:pStyle w:val="Compact"/>
-              <w:jc w:val="left"/>
-            </w:pPr>
-            <w:r>
-              <w:t xml:space="preserve">TBD</w:t>
+              <w:t xml:space="preserve">55 SP</w:t>
+            </w:r>
+          </w:p>
+        </w:tc>
+        <w:tc>
+          <w:tcPr/>
+          <w:p>
+            <w:pPr>
+              <w:pStyle w:val="Compact"/>
+              <w:jc w:val="left"/>
+            </w:pPr>
+            <w:r>
+              <w:t xml:space="preserve">24,000,000 VND</w:t>
             </w:r>
           </w:p>
         </w:tc>
@@ -5787,19 +5858,19 @@
               <w:jc w:val="left"/>
             </w:pPr>
             <w:r>
-              <w:t xml:space="preserve">TBD</w:t>
-            </w:r>
-          </w:p>
-        </w:tc>
-        <w:tc>
-          <w:tcPr/>
-          <w:p>
-            <w:pPr>
-              <w:pStyle w:val="Compact"/>
-              <w:jc w:val="left"/>
-            </w:pPr>
-            <w:r>
-              <w:t xml:space="preserve">TBD</w:t>
+              <w:t xml:space="preserve">62 SP (proposed)</w:t>
+            </w:r>
+          </w:p>
+        </w:tc>
+        <w:tc>
+          <w:tcPr/>
+          <w:p>
+            <w:pPr>
+              <w:pStyle w:val="Compact"/>
+              <w:jc w:val="left"/>
+            </w:pPr>
+            <w:r>
+              <w:t xml:space="preserve">per CCB decision</w:t>
             </w:r>
           </w:p>
         </w:tc>

</xml_diff>